<commit_message>
fix: correct repo link in solution walkthrough
</commit_message>
<xml_diff>
--- a/docs/DurgaPrasad.docx
+++ b/docs/DurgaPrasad.docx
@@ -4637,7 +4637,7 @@
           <w:sz w:val="21"/>
           <w:szCs w:val="21"/>
         </w:rPr>
-        <w:t xml:space="preserve">github.com/dpgaharwal/mastercard-defense-lab</w:t>
+        <w:t xml:space="preserve">github.com/dpgaharwal/Durga-Prasad</w:t>
       </w:r>
     </w:p>
     <w:p>
@@ -4652,7 +4652,7 @@
           <w:sz w:val="21"/>
           <w:szCs w:val="21"/>
         </w:rPr>
-        <w:t xml:space="preserve">Web prototype: </w:t>
+        <w:t xml:space="preserve">Live web prototype: </w:t>
       </w:r>
       <w:r>
         <w:rPr>
@@ -4660,7 +4660,7 @@
           <w:sz w:val="21"/>
           <w:szCs w:val="21"/>
         </w:rPr>
-        <w:t xml:space="preserve">web/frontend/index.html — static, opens directly; live mode via web/backend (README included)</w:t>
+        <w:t xml:space="preserve">dpgaharwal.github.io/Durga-Prasad — hosted, opens directly; live-backend mode via web/backend (README included, requires local setup)</w:t>
       </w:r>
     </w:p>
     <w:p>

</xml_diff>